<commit_message>
docs: corrige ADR 0003 para refletir backend Terraform real por repositório
O ADR 0003 descrevia um bucket S3 (techchallenge-tfstate) e tabela
DynamoDB (techchallenge-tf-locks) compartilhados entre
tech-challenge-database e tech-challenge-lambda-functions. Na prática,
apenas o database segue esse plano — o lambda-functions provisionou
seu próprio backend isolado (tech-challenge-lambda-functions-477478162709-tfstate
/ tech-challenge-terraform-locks), verificado direto no código dos dois
repositórios em 2026-09-14. Atualiza texto, tabela e exemplos de
configuração da ADR e regera o PDF a partir do docx.

Co-Authored-By: Claude Sonnet 5 <noreply@anthropic.com>
Claude-Session: https://claude.ai/code/session_014pJjRhuLkVcHWPX4oTwjBW
</commit_message>
<xml_diff>
--- a/docs/Fase3/ADRs.docx
+++ b/docs/Fase3/ADRs.docx
@@ -692,8 +692,7 @@
         <w:pStyle w:val="Ttulo1"/>
       </w:pPr>
       <w:r>
-        <w:lastRenderedPageBreak/>
-        <w:t>ADR 0003 — Backend remoto de Terraform compartilhado (S3 + DynamoDB)</w:t>
+        <w:t>ADR 0003 — Backend remoto de Terraform (S3 + DynamoDB) por repositório</w:t>
       </w:r>
     </w:p>
     <w:p>
@@ -774,7 +773,27 @@
     </w:p>
     <w:p>
       <w:r>
-        <w:t>Provisionar, uma única vez e fora do Terraform gerenciado pelos próprios repositórios (para evitar o problema de "ovo e galinha" de um backend remoto gerenciar seu próprio bootstrap):</w:t>
+        <w:t xml:space="preserve">Provisionar um backend remoto S3 + DynamoDB para eliminar o state local, fora do Terraform gerenciado pelos próprios repositórios (para evitar o problema de "ovo e galinha" de um backend remoto gerenciar seu próprio bootstrap). Na decisão original, os dois repositórios reaproveitariam o mesmo bucket/tabela — na implementação real, apenas </w:t>
+      </w:r>
+      <w:r>
+        <w:rPr>
+          <w:rFonts w:ascii="Consolas" w:hAnsi="Consolas" w:eastAsia="Consolas"/>
+          <w:sz w:val="20"/>
+        </w:rPr>
+        <w:t>tech-challenge-database</w:t>
+      </w:r>
+      <w:r>
+        <w:t xml:space="preserve"> seguiu esse plano; </w:t>
+      </w:r>
+      <w:r>
+        <w:rPr>
+          <w:rFonts w:ascii="Consolas" w:hAnsi="Consolas" w:eastAsia="Consolas"/>
+          <w:sz w:val="20"/>
+        </w:rPr>
+        <w:t>tech-challenge-lambda-functions</w:t>
+      </w:r>
+      <w:r>
+        <w:t xml:space="preserve"> provisionou seu próprio backend, sem compartilhar recursos com o outro repositório.</w:t>
       </w:r>
     </w:p>
     <w:p>
@@ -786,13 +805,23 @@
       </w:r>
       <w:r>
         <w:rPr>
-          <w:rFonts w:ascii="Consolas" w:hAnsi="Consolas"/>
+          <w:rFonts w:ascii="Consolas" w:hAnsi="Consolas" w:eastAsia="Consolas"/>
           <w:sz w:val="20"/>
         </w:rPr>
         <w:t>techchallenge-tfstate</w:t>
       </w:r>
       <w:r>
-        <w:t>) para armazenar os arquivos de state.</w:t>
+        <w:t xml:space="preserve">) usado por </w:t>
+      </w:r>
+      <w:r>
+        <w:rPr>
+          <w:rFonts w:ascii="Consolas" w:hAnsi="Consolas" w:eastAsia="Consolas"/>
+          <w:sz w:val="20"/>
+        </w:rPr>
+        <w:t>tech-challenge-database</w:t>
+      </w:r>
+      <w:r>
+        <w:t xml:space="preserve"> para armazenar seus arquivos de state.</w:t>
       </w:r>
     </w:p>
     <w:p>
@@ -804,7 +833,7 @@
       </w:r>
       <w:r>
         <w:rPr>
-          <w:rFonts w:ascii="Consolas" w:hAnsi="Consolas"/>
+          <w:rFonts w:ascii="Consolas" w:hAnsi="Consolas" w:eastAsia="Consolas"/>
           <w:sz w:val="20"/>
         </w:rPr>
         <w:t>techchallenge-tf-locks</w:t>
@@ -814,7 +843,7 @@
       </w:r>
       <w:r>
         <w:rPr>
-          <w:rFonts w:ascii="Consolas" w:hAnsi="Consolas"/>
+          <w:rFonts w:ascii="Consolas" w:hAnsi="Consolas" w:eastAsia="Consolas"/>
           <w:sz w:val="20"/>
         </w:rPr>
         <w:t>LockID</w:t>
@@ -824,27 +853,73 @@
       </w:r>
       <w:r>
         <w:rPr>
-          <w:rFonts w:ascii="Consolas" w:hAnsi="Consolas"/>
+          <w:rFonts w:ascii="Consolas" w:hAnsi="Consolas" w:eastAsia="Consolas"/>
           <w:sz w:val="20"/>
         </w:rPr>
         <w:t>PAY_PER_REQUEST</w:t>
       </w:r>
       <w:r>
-        <w:t>, usada exclusivamente como mutex distribuído de lock — nenhum outro atributo ou uso de dados.</w:t>
+        <w:t xml:space="preserve">, usada por </w:t>
+      </w:r>
+      <w:r>
+        <w:rPr>
+          <w:rFonts w:ascii="Consolas" w:hAnsi="Consolas" w:eastAsia="Consolas"/>
+          <w:sz w:val="20"/>
+        </w:rPr>
+        <w:t>tech-challenge-database</w:t>
+      </w:r>
+      <w:r>
+        <w:t xml:space="preserve"> exclusivamente como mutex distribuído de lock — nenhum outro atributo ou uso de dados.</w:t>
       </w:r>
     </w:p>
     <w:p>
-      <w:r>
-        <w:t xml:space="preserve">Cada repositório referencia o mesmo bucket/tabela, mas com uma </w:t>
-      </w:r>
-      <w:r>
-        <w:rPr>
-          <w:b/>
-        </w:rPr>
-        <w:t>key de state distinta</w:t>
-      </w:r>
-      <w:r>
-        <w:t>, isolando os states entre si:</w:t>
+      <w:pPr>
+        <w:pStyle w:val="Commarcadores"/>
+      </w:pPr>
+      <w:r>
+        <w:rPr>
+          <w:rFonts w:ascii="Consolas" w:hAnsi="Consolas" w:eastAsia="Consolas"/>
+          <w:sz w:val="20"/>
+        </w:rPr>
+        <w:t>tech-challenge-lambda-functions</w:t>
+      </w:r>
+      <w:r>
+        <w:t xml:space="preserve"> usa um backend próprio, não compartilhado: bucket S3 </w:t>
+      </w:r>
+      <w:r>
+        <w:rPr>
+          <w:rFonts w:ascii="Consolas" w:hAnsi="Consolas" w:eastAsia="Consolas"/>
+          <w:sz w:val="20"/>
+        </w:rPr>
+        <w:t>tech-challenge-lambda-functions-477478162709-tfstate</w:t>
+      </w:r>
+      <w:r>
+        <w:t xml:space="preserve"> e tabela DynamoDB </w:t>
+      </w:r>
+      <w:r>
+        <w:rPr>
+          <w:rFonts w:ascii="Consolas" w:hAnsi="Consolas" w:eastAsia="Consolas"/>
+          <w:sz w:val="20"/>
+        </w:rPr>
+        <w:t>tech-challenge-terraform-locks</w:t>
+      </w:r>
+      <w:r>
+        <w:t>, provisionados separadamente para este repositório (verificado em 2026-09-14).</w:t>
+      </w:r>
+    </w:p>
+    <w:p>
+      <w:r>
+        <w:t xml:space="preserve">Configuração real do backend remoto usada por </w:t>
+      </w:r>
+      <w:r>
+        <w:rPr>
+          <w:rFonts w:ascii="Consolas" w:hAnsi="Consolas" w:eastAsia="Consolas"/>
+          <w:sz w:val="20"/>
+        </w:rPr>
+        <w:t>tech-challenge-database</w:t>
+      </w:r>
+      <w:r>
+        <w:t xml:space="preserve"> (a única que segue o plano original desta ADR):</w:t>
       </w:r>
     </w:p>
     <w:tbl>
@@ -881,7 +956,7 @@
               <w:cnfStyle w:val="100000000000" w:firstRow="1" w:lastRow="0" w:firstColumn="0" w:lastColumn="0" w:oddVBand="0" w:evenVBand="0" w:oddHBand="0" w:evenHBand="0" w:firstRowFirstColumn="0" w:firstRowLastColumn="0" w:lastRowFirstColumn="0" w:lastRowLastColumn="0"/>
             </w:pPr>
             <w:r>
-              <w:t>Key no S3</w:t>
+              <w:t>Backend remoto (bucket · key · tabela DynamoDB)</w:t>
             </w:r>
           </w:p>
         </w:tc>
@@ -897,7 +972,7 @@
           </w:tcPr>
           <w:p>
             <w:r>
-              <w:t>`tech-challenge-lambda-functions`</w:t>
+              <w:t>tech-challenge-lambda-functions</w:t>
             </w:r>
           </w:p>
         </w:tc>
@@ -910,7 +985,7 @@
               <w:cnfStyle w:val="000000100000" w:firstRow="0" w:lastRow="0" w:firstColumn="0" w:lastColumn="0" w:oddVBand="0" w:evenVBand="0" w:oddHBand="1" w:evenHBand="0" w:firstRowFirstColumn="0" w:firstRowLastColumn="0" w:lastRowFirstColumn="0" w:lastRowLastColumn="0"/>
             </w:pPr>
             <w:r>
-              <w:t>`lambda-auth/terraform.tfstate`</w:t>
+              <w:t>tech-challenge-lambda-functions-477478162709-tfstate · tech-challenge-lambda-functions/terraform.tfstate · tech-challenge-terraform-locks</w:t>
             </w:r>
           </w:p>
         </w:tc>
@@ -926,7 +1001,7 @@
           </w:tcPr>
           <w:p>
             <w:r>
-              <w:t>`tech-challenge-database`</w:t>
+              <w:t>tech-challenge-database</w:t>
             </w:r>
           </w:p>
         </w:tc>
@@ -939,7 +1014,7 @@
               <w:cnfStyle w:val="000000010000" w:firstRow="0" w:lastRow="0" w:firstColumn="0" w:lastColumn="0" w:oddVBand="0" w:evenVBand="0" w:oddHBand="0" w:evenHBand="1" w:firstRowFirstColumn="0" w:firstRowLastColumn="0" w:lastRowFirstColumn="0" w:lastRowLastColumn="0"/>
             </w:pPr>
             <w:r>
-              <w:t>`database/terraform.tfstate`</w:t>
+              <w:t>techchallenge-tfstate · database/terraform.tfstate · techchallenge-tf-locks</w:t>
             </w:r>
           </w:p>
         </w:tc>
@@ -951,14 +1026,14 @@
       </w:pPr>
       <w:r>
         <w:rPr>
-          <w:rFonts w:ascii="Consolas" w:hAnsi="Consolas"/>
+          <w:rFonts w:ascii="Consolas" w:hAnsi="Consolas" w:eastAsia="Consolas"/>
           <w:sz w:val="18"/>
         </w:rPr>
         <w:t>terraform {</w:t>
       </w:r>
       <w:r>
         <w:rPr>
-          <w:rFonts w:ascii="Consolas" w:hAnsi="Consolas"/>
+          <w:rFonts w:ascii="Consolas" w:hAnsi="Consolas" w:eastAsia="Consolas"/>
           <w:sz w:val="18"/>
         </w:rPr>
         <w:br/>
@@ -966,7 +1041,7 @@
       </w:r>
       <w:r>
         <w:rPr>
-          <w:rFonts w:ascii="Consolas" w:hAnsi="Consolas"/>
+          <w:rFonts w:ascii="Consolas" w:hAnsi="Consolas" w:eastAsia="Consolas"/>
           <w:sz w:val="18"/>
         </w:rPr>
         <w:br/>
@@ -974,15 +1049,15 @@
       </w:r>
       <w:r>
         <w:rPr>
-          <w:rFonts w:ascii="Consolas" w:hAnsi="Consolas"/>
+          <w:rFonts w:ascii="Consolas" w:hAnsi="Consolas" w:eastAsia="Consolas"/>
           <w:sz w:val="18"/>
         </w:rPr>
         <w:br/>
-        <w:t xml:space="preserve">    key            = "&lt;repo&gt;/terraform.tfstate"</w:t>
-      </w:r>
-      <w:r>
-        <w:rPr>
-          <w:rFonts w:ascii="Consolas" w:hAnsi="Consolas"/>
+        <w:t xml:space="preserve">    key            = "database/terraform.tfstate"</w:t>
+      </w:r>
+      <w:r>
+        <w:rPr>
+          <w:rFonts w:ascii="Consolas" w:hAnsi="Consolas" w:eastAsia="Consolas"/>
           <w:sz w:val="18"/>
         </w:rPr>
         <w:br/>
@@ -990,7 +1065,7 @@
       </w:r>
       <w:r>
         <w:rPr>
-          <w:rFonts w:ascii="Consolas" w:hAnsi="Consolas"/>
+          <w:rFonts w:ascii="Consolas" w:hAnsi="Consolas" w:eastAsia="Consolas"/>
           <w:sz w:val="18"/>
         </w:rPr>
         <w:br/>
@@ -998,7 +1073,7 @@
       </w:r>
       <w:r>
         <w:rPr>
-          <w:rFonts w:ascii="Consolas" w:hAnsi="Consolas"/>
+          <w:rFonts w:ascii="Consolas" w:hAnsi="Consolas" w:eastAsia="Consolas"/>
           <w:sz w:val="18"/>
         </w:rPr>
         <w:br/>
@@ -1006,7 +1081,7 @@
       </w:r>
       <w:r>
         <w:rPr>
-          <w:rFonts w:ascii="Consolas" w:hAnsi="Consolas"/>
+          <w:rFonts w:ascii="Consolas" w:hAnsi="Consolas" w:eastAsia="Consolas"/>
           <w:sz w:val="18"/>
         </w:rPr>
         <w:br/>
@@ -1014,7 +1089,7 @@
       </w:r>
       <w:r>
         <w:rPr>
-          <w:rFonts w:ascii="Consolas" w:hAnsi="Consolas"/>
+          <w:rFonts w:ascii="Consolas" w:hAnsi="Consolas" w:eastAsia="Consolas"/>
           <w:sz w:val="18"/>
         </w:rPr>
         <w:br/>
@@ -1022,19 +1097,133 @@
       </w:r>
     </w:p>
     <w:p>
-      <w:r>
-        <w:t>O bootstrap do bucket/tabela é feito manualmente uma única vez via AWS CLI por um humano com credenciais reais — nunca por um pipeline de CI, já que o próprio backend que os pipelines usam depende desses recursos existirem primeiro.</w:t>
+      <w:pPr>
+        <w:ind w:left="432"/>
+      </w:pPr>
+      <w:r>
+        <w:t xml:space="preserve">Configuração real do backend remoto usada por </w:t>
+      </w:r>
+      <w:r>
+        <w:rPr>
+          <w:rFonts w:ascii="Consolas" w:hAnsi="Consolas" w:eastAsia="Consolas"/>
+          <w:sz w:val="20"/>
+        </w:rPr>
+        <w:t>tech-challenge-lambda-functions</w:t>
+      </w:r>
+      <w:r>
+        <w:t xml:space="preserve"> — backend próprio, criado à parte, sem reaproveitar o bucket/tabela acima:</w:t>
       </w:r>
     </w:p>
     <w:p>
       <w:pPr>
-        <w:pStyle w:val="Ttulo2"/>
-      </w:pPr>
-      <w:r>
-        <w:t>Consequências</w:t>
+        <w:ind w:left="432"/>
+      </w:pPr>
+      <w:r>
+        <w:rPr>
+          <w:rFonts w:ascii="Consolas" w:hAnsi="Consolas" w:eastAsia="Consolas"/>
+          <w:sz w:val="18"/>
+        </w:rPr>
+        <w:t>terraform {</w:t>
+      </w:r>
+      <w:r>
+        <w:rPr>
+          <w:rFonts w:ascii="Consolas" w:hAnsi="Consolas" w:eastAsia="Consolas"/>
+          <w:sz w:val="18"/>
+        </w:rPr>
+        <w:br/>
+        <w:t xml:space="preserve">  backend "s3" {</w:t>
+      </w:r>
+      <w:r>
+        <w:rPr>
+          <w:rFonts w:ascii="Consolas" w:hAnsi="Consolas" w:eastAsia="Consolas"/>
+          <w:sz w:val="18"/>
+        </w:rPr>
+        <w:br/>
+        <w:t xml:space="preserve">    bucket         = "tech-challenge-lambda-functions-477478162709-tfstate"</w:t>
+      </w:r>
+      <w:r>
+        <w:rPr>
+          <w:rFonts w:ascii="Consolas" w:hAnsi="Consolas" w:eastAsia="Consolas"/>
+          <w:sz w:val="18"/>
+        </w:rPr>
+        <w:br/>
+        <w:t xml:space="preserve">    key            = "tech-challenge-lambda-functions/terraform.tfstate"</w:t>
+      </w:r>
+      <w:r>
+        <w:rPr>
+          <w:rFonts w:ascii="Consolas" w:hAnsi="Consolas" w:eastAsia="Consolas"/>
+          <w:sz w:val="18"/>
+        </w:rPr>
+        <w:br/>
+        <w:t xml:space="preserve">    region         = "us-east-1"</w:t>
+      </w:r>
+      <w:r>
+        <w:rPr>
+          <w:rFonts w:ascii="Consolas" w:hAnsi="Consolas" w:eastAsia="Consolas"/>
+          <w:sz w:val="18"/>
+        </w:rPr>
+        <w:br/>
+        <w:t xml:space="preserve">    dynamodb_table = "tech-challenge-terraform-locks"</w:t>
+      </w:r>
+      <w:r>
+        <w:rPr>
+          <w:rFonts w:ascii="Consolas" w:hAnsi="Consolas" w:eastAsia="Consolas"/>
+          <w:sz w:val="18"/>
+        </w:rPr>
+        <w:br/>
+        <w:t xml:space="preserve">    encrypt        = true</w:t>
+      </w:r>
+      <w:r>
+        <w:rPr>
+          <w:rFonts w:ascii="Consolas" w:hAnsi="Consolas" w:eastAsia="Consolas"/>
+          <w:sz w:val="18"/>
+        </w:rPr>
+        <w:br/>
+        <w:t xml:space="preserve">  }</w:t>
+      </w:r>
+      <w:r>
+        <w:rPr>
+          <w:rFonts w:ascii="Consolas" w:hAnsi="Consolas" w:eastAsia="Consolas"/>
+          <w:sz w:val="18"/>
+        </w:rPr>
+        <w:br/>
+        <w:t>}</w:t>
       </w:r>
     </w:p>
     <w:p>
+      <w:r>
+        <w:t xml:space="preserve">O bootstrap do bucket/tabela usados por </w:t>
+      </w:r>
+      <w:r>
+        <w:rPr>
+          <w:rFonts w:ascii="Consolas" w:hAnsi="Consolas" w:eastAsia="Consolas"/>
+          <w:sz w:val="20"/>
+        </w:rPr>
+        <w:t>tech-challenge-database</w:t>
+      </w:r>
+      <w:r>
+        <w:t xml:space="preserve"> foi feito manualmente uma única vez via AWS CLI por um humano com credenciais reais — nunca por um pipeline de CI, já que o próprio backend que os pipelines usam depende desses recursos existirem primeiro. </w:t>
+      </w:r>
+      <w:r>
+        <w:rPr>
+          <w:rFonts w:ascii="Consolas" w:hAnsi="Consolas" w:eastAsia="Consolas"/>
+          <w:sz w:val="20"/>
+        </w:rPr>
+        <w:t>tech-challenge-lambda-functions</w:t>
+      </w:r>
+      <w:r>
+        <w:t xml:space="preserve"> seguiu um caminho equivalente, mas com bucket/tabela próprios — esse bootstrap não está documentado nesta ADR.</w:t>
+      </w:r>
+    </w:p>
+    <w:p>
+      <w:pPr>
+        <w:pStyle w:val="Ttulo2"/>
+      </w:pPr>
+      <w:r>
+        <w:t>Consequências</w:t>
+      </w:r>
+    </w:p>
+    <w:p>
       <w:pPr>
         <w:pStyle w:val="Commarcadores"/>
       </w:pPr>
@@ -1099,17 +1288,27 @@
         <w:pStyle w:val="Commarcadores"/>
       </w:pPr>
       <w:r>
-        <w:t xml:space="preserve">Qualquer novo repositório de infraestrutura adicionado ao sistema deve, por padrão, reaproveitar o mesmo bucket/tabela com uma nova </w:t>
-      </w:r>
-      <w:r>
-        <w:rPr>
-          <w:rFonts w:ascii="Consolas" w:hAnsi="Consolas"/>
+        <w:t xml:space="preserve">Na prática, </w:t>
+      </w:r>
+      <w:r>
+        <w:rPr>
+          <w:rFonts w:ascii="Consolas" w:hAnsi="Consolas" w:eastAsia="Consolas"/>
           <w:sz w:val="20"/>
         </w:rPr>
-        <w:t>key</w:t>
-      </w:r>
-      <w:r>
-        <w:t>, em vez de provisionar seu próprio backend — mantendo um único ponto de bootstrap e de custo (S3 + DynamoDB pay-per-request, ambos de custo desprezível neste volume).</w:t>
+        <w:t>tech-challenge-lambda-functions</w:t>
+      </w:r>
+      <w:r>
+        <w:t xml:space="preserve"> não reaproveitou o bucket/tabela de </w:t>
+      </w:r>
+      <w:r>
+        <w:rPr>
+          <w:rFonts w:ascii="Consolas" w:hAnsi="Consolas" w:eastAsia="Consolas"/>
+          <w:sz w:val="20"/>
+        </w:rPr>
+        <w:t>tech-challenge-database</w:t>
+      </w:r>
+      <w:r>
+        <w:t xml:space="preserve"> — cada repositório com Terraform mantém hoje seu próprio backend remoto isolado, e não um bucket/tabela único compartilhado por todos, como esta ADR previa originalmente (verificado em 2026-09-14).</w:t>
       </w:r>
     </w:p>
     <w:p>

</xml_diff>